<commit_message>
docs: concept-paper-v0.6 evidence-boundary and tighten claims
</commit_message>
<xml_diff>
--- a/docs/concept_paper_v0.6.docx
+++ b/docs/concept_paper_v0.6.docx
@@ -2701,6 +2701,19 @@
       </w:r>
     </w:p>
     <w:p>
+      <w:r>
+        <w:rPr>
+          <w:i/>
+          <w:color w:val="808080"/>
+        </w:rPr>
+        <w:t xml:space="preserve">注：Structure Monitoring目前仍是独立探索分支（来自TEP研究），</w:t>
+        <w:br/>
+        <w:t xml:space="preserve">尚未整合进HVAC验证链路。TEP→Marine迁移未完成，</w:t>
+        <w:br/>
+        <w:t xml:space="preserve">当前主验证路线为：Expected State → Residual → HI → Trend。</w:t>
+      </w:r>
+    </w:p>
+    <w:p>
       <w:pPr>
         <w:spacing w:after="60"/>
         <w:ind w:left="560"/>
@@ -3279,12 +3292,9 @@
           </w:tcPr>
           <w:p>
             <w:r>
-              <w:rPr>
-                <w:rFonts w:ascii="Arial" w:cs="Arial" w:eastAsia="Arial" w:hAnsi="Arial"/>
-                <w:sz w:val="20"/>
-                <w:szCs w:val="20"/>
-              </w:rPr>
-              <w:t xml:space="preserve">化工仿真数据集上验证：性能退化型故障存在稳定统计结构（F13/F14 archetype，500-run验证通过）。注：仅在TEP仿真环境验证，Marine迁移尚未验证。</w:t>
+              <w:t xml:space="preserve">化工仿真数据集上观察到：性能退化型故障在表示空间中呈现稳定统计结构现象</w:t>
+              <w:br/>
+              <w:t xml:space="preserve">（F13/F14 archetype，500-run验证通过）。注：仅在TEP仿真环境验证，Marine迁移尚未验证。</w:t>
             </w:r>
           </w:p>
         </w:tc>
@@ -9367,6 +9377,22 @@
     </w:p>
     <w:p>
       <w:r>
+        <w:rPr>
+          <w:b/>
+          <w:color w:val="C00000"/>
+        </w:rPr>
+        <w:t xml:space="preserve">当前科学瓶颈：Q4b是当前主要研究风险。</w:t>
+      </w:r>
+    </w:p>
+    <w:p>
+      <w:r>
+        <w:t xml:space="preserve">• Q4b的解决与否，将决定项目能否从Health Monitoring</w:t>
+        <w:br/>
+        <w:t xml:space="preserve">  走向完整PHM（Prognostics and Health Management）</w:t>
+      </w:r>
+    </w:p>
+    <w:p>
+      <w:r>
         <w:t xml:space="preserve">长期健康度监测的有效性依赖于Baseline Management。</w:t>
         <w:br/>
         <w:t xml:space="preserve">维护事件会导致系统状态发生阶跃性变化，若不处理，</w:t>
@@ -9603,20 +9629,199 @@
       </w:r>
     </w:p>
     <w:p>
+      <w:r>
+        <w:t xml:space="preserve">12. Evidence Boundary（证据边界）</w:t>
+      </w:r>
+    </w:p>
+    <w:p>
+      <w:r>
+        <w:rPr>
+          <w:b/>
+        </w:rPr>
+        <w:t xml:space="preserve">所有当前证据均来自以下两个数据集，尚未在Marine域验证：</w:t>
+      </w:r>
+    </w:p>
+    <w:tbl>
+      <w:tblPr>
+        <w:tblW w:w="0" w:type="auto"/>
+        <w:tblBorders>
+          <w:top w:val="single" w:sz="4" w:space="0" w:color="auto"/>
+          <w:left w:val="single" w:sz="4" w:space="0" w:color="auto"/>
+          <w:bottom w:val="single" w:sz="4" w:space="0" w:color="auto"/>
+          <w:right w:val="single" w:sz="4" w:space="0" w:color="auto"/>
+          <w:insideH w:val="single" w:sz="4" w:space="0" w:color="auto"/>
+          <w:insideV w:val="single" w:sz="4" w:space="0" w:color="auto"/>
+        </w:tblBorders>
+      </w:tblPr>
+      <w:tr>
+        <w:tc>
+          <w:tcPr>
+            <w:tcW w:w="3000" w:type="dxa"/>
+          </w:tcPr>
+          <w:p>
+            <w:r>
+              <w:rPr>
+                <w:b/>
+              </w:rPr>
+              <w:t xml:space="preserve">数据集</w:t>
+            </w:r>
+          </w:p>
+        </w:tc>
+        <w:tc>
+          <w:tcPr>
+            <w:tcW w:w="3000" w:type="dxa"/>
+          </w:tcPr>
+          <w:p>
+            <w:r>
+              <w:rPr>
+                <w:b/>
+              </w:rPr>
+              <w:t xml:space="preserve">类型</w:t>
+            </w:r>
+          </w:p>
+        </w:tc>
+        <w:tc>
+          <w:tcPr>
+            <w:tcW w:w="3000" w:type="dxa"/>
+          </w:tcPr>
+          <w:p>
+            <w:r>
+              <w:rPr>
+                <w:b/>
+              </w:rPr>
+              <w:t xml:space="preserve">已验证内容</w:t>
+            </w:r>
+          </w:p>
+        </w:tc>
+        <w:tc>
+          <w:tcPr>
+            <w:tcW w:w="3000" w:type="dxa"/>
+          </w:tcPr>
+          <w:p>
+            <w:r>
+              <w:rPr>
+                <w:b/>
+              </w:rPr>
+              <w:t xml:space="preserve">局限性</w:t>
+            </w:r>
+          </w:p>
+        </w:tc>
+      </w:tr>
+      <w:tr>
+        <w:tc>
+          <w:tcPr>
+            <w:tcW w:w="3000" w:type="dxa"/>
+          </w:tcPr>
+          <w:p>
+            <w:r>
+              <w:t xml:space="preserve">TEP (Tennessee Eastman Process)</w:t>
+            </w:r>
+          </w:p>
+        </w:tc>
+        <w:tc>
+          <w:tcPr>
+            <w:tcW w:w="3000" w:type="dxa"/>
+          </w:tcPr>
+          <w:p>
+            <w:r>
+              <w:t xml:space="preserve">化工过程仿真</w:t>
+            </w:r>
+          </w:p>
+        </w:tc>
+        <w:tc>
+          <w:tcPr>
+            <w:tcW w:w="3000" w:type="dxa"/>
+          </w:tcPr>
+          <w:p>
+            <w:r>
+              <w:t xml:space="preserve">Q1部分、统计结构现象</w:t>
+            </w:r>
+          </w:p>
+        </w:tc>
+        <w:tc>
+          <w:tcPr>
+            <w:tcW w:w="3000" w:type="dxa"/>
+          </w:tcPr>
+          <w:p>
+            <w:r>
+              <w:t xml:space="preserve">仿真环境，非真实设备</w:t>
+            </w:r>
+          </w:p>
+        </w:tc>
+      </w:tr>
+      <w:tr>
+        <w:tc>
+          <w:tcPr>
+            <w:tcW w:w="3000" w:type="dxa"/>
+          </w:tcPr>
+          <w:p>
+            <w:r>
+              <w:t xml:space="preserve">LBNL Chiller Plant</w:t>
+            </w:r>
+          </w:p>
+        </w:tc>
+        <w:tc>
+          <w:tcPr>
+            <w:tcW w:w="3000" w:type="dxa"/>
+          </w:tcPr>
+          <w:p>
+            <w:r>
+              <w:t xml:space="preserve">建筑HVAC冷水机组</w:t>
+            </w:r>
+          </w:p>
+        </w:tc>
+        <w:tc>
+          <w:tcPr>
+            <w:tcW w:w="3000" w:type="dxa"/>
+          </w:tcPr>
+          <w:p>
+            <w:r>
+              <w:t xml:space="preserve">Q1完整、Q2、Q3、Q4a</w:t>
+            </w:r>
+          </w:p>
+        </w:tc>
+        <w:tc>
+          <w:tcPr>
+            <w:tcW w:w="3000" w:type="dxa"/>
+          </w:tcPr>
+          <w:p>
+            <w:r>
+              <w:t xml:space="preserve">故障注入数据，非自然退化；无维护事件</w:t>
+            </w:r>
+          </w:p>
+        </w:tc>
+      </w:tr>
+    </w:tbl>
+    <w:p>
+      <w:r>
+        <w:t xml:space="preserve">当前结果支持方法论可行性（methodological feasibility），</w:t>
+        <w:br/>
+        <w:t xml:space="preserve">但不构成对真实船舶系统有效性的证据。</w:t>
+      </w:r>
+    </w:p>
+    <w:p>
+      <w:pPr>
+        <w:shd w:fill="D9EAF7"/>
+      </w:pPr>
+      <w:r>
+        <w:t xml:space="preserve">Marine域验证是Validation C和Validation D的目标。</w:t>
+        <w:br/>
+        <w:t xml:space="preserve">在此之前，所有关于Marine系统的结论均为推断，</w:t>
+        <w:br/>
+        <w:t xml:space="preserve">不应作为工程决策依据。</w:t>
+      </w:r>
+    </w:p>
+    <w:p>
       <w:pPr>
         <w:spacing w:before="200"/>
         <w:jc w:val="center"/>
       </w:pPr>
       <w:r>
-        <w:t xml:space="preserve">本文档为内部讨论稿 v0.6 | 2026.06.05 | 下一步：Baseline Management实现 + Validation C/D</w:t>
-      </w:r>
-    </w:p>
-    <w:sectPr>
-      <w:pgSz w:w="11906" w:h="16838" w:orient="portrait"/>
-      <w:pgMar w:top="1440" w:right="1440" w:bottom="1440" w:left="1440" w:header="708" w:footer="708" w:gutter="0"/>
-      <w:pgNumType/>
-      <w:docGrid w:linePitch="360"/>
-    </w:sectPr>
+        <w:t xml:space="preserve">本文档为内部讨论稿 v0.6 | 2026.06.05 |</w:t>
+        <w:br/>
+        <w:t xml:space="preserve">下一步：Q4b Baseline Management数据集调研 + Evidence Boundary明确</w:t>
+      </w:r>
+    </w:p>
   </w:body>
 </w:document>
 </file>

</xml_diff>